<commit_message>
Add final_price_vat and update Arabic wording
Include a numeric VAT-inclusive field in sponsor contract data and normalize the Arabic currency wording.

- registration service: add final_price_vat (formatted SAR) to sponsorContractValues and change arabicSaudiRiyalWords to append ' ريال' instead of ' ريال سعودي'.
- update sponsor-contract.docx template (binary) to reflect the new placeholder.
- tests: set and assert both final_price_vat (numeric SAR) and final_price (Arabic words without 'سعودي') across the provider cases and lifecycle test.

This separates the numeric VAT-inclusive price from the Arabic written amount and aligns template/tests with the new fields.
</commit_message>
<xml_diff>
--- a/public/sponsor-contract.docx
+++ b/public/sponsor-contract.docx
@@ -1693,7 +1693,25 @@
                 <w:sz w:val="24"/>
                 <w:szCs w:val="24"/>
               </w:rPr>
-              <w:t>${final_price}</w:t>
+              <w:t>${final_price</w:t>
+            </w:r>
+            <w:r>
+              <w:rPr>
+                <w:b w:val="1"/>
+                <w:bCs w:val="1"/>
+                <w:sz w:val="24"/>
+                <w:szCs w:val="24"/>
+              </w:rPr>
+              <w:t>_vat</w:t>
+            </w:r>
+            <w:r>
+              <w:rPr>
+                <w:b w:val="1"/>
+                <w:bCs w:val="1"/>
+                <w:sz w:val="24"/>
+                <w:szCs w:val="24"/>
+              </w:rPr>
+              <w:t>}</w:t>
             </w:r>
           </w:p>
         </w:tc>
@@ -1766,15 +1784,40 @@
           </w:tcPr>
           <w:p>
             <w:pPr>
-              <w:bidi/>
+              <w:bidi w:val="0"/>
+              <w:jc w:val="center"/>
               <w:rPr>
-                <w:b/>
-                <w:bCs/>
+                <w:rFonts w:ascii="Calibri" w:hAnsi="Calibri" w:eastAsia="Calibri" w:cs="Calibri"/>
+                <w:b w:val="1"/>
+                <w:bCs w:val="1"/>
+                <w:i w:val="0"/>
+                <w:iCs w:val="0"/>
+                <w:caps w:val="0"/>
+                <w:smallCaps w:val="0"/>
+                <w:noProof w:val="0"/>
+                <w:color w:val="000000" w:themeColor="text1" w:themeTint="FF" w:themeShade="FF"/>
                 <w:sz w:val="24"/>
                 <w:szCs w:val="24"/>
-                <w:rtl/>
+                <w:lang w:val="en-US"/>
               </w:rPr>
             </w:pPr>
+            <w:r>
+              <w:rPr>
+                <w:rFonts w:ascii="Calibri" w:hAnsi="Calibri" w:eastAsia="Calibri" w:cs="Calibri"/>
+                <w:b w:val="1"/>
+                <w:bCs w:val="1"/>
+                <w:i w:val="0"/>
+                <w:iCs w:val="0"/>
+                <w:caps w:val="0"/>
+                <w:smallCaps w:val="0"/>
+                <w:noProof w:val="0"/>
+                <w:color w:val="000000" w:themeColor="text1" w:themeTint="FF" w:themeShade="FF"/>
+                <w:sz w:val="24"/>
+                <w:szCs w:val="24"/>
+                <w:lang w:val="en-US"/>
+              </w:rPr>
+              <w:t>${final_price}</w:t>
+            </w:r>
           </w:p>
         </w:tc>
       </w:tr>

</xml_diff>